<commit_message>
feat: update print templates and question-based selection
</commit_message>
<xml_diff>
--- a/templates/simulation/simulation-result.docx
+++ b/templates/simulation/simulation-result.docx
@@ -2,11 +2,6 @@
 <file path=word/document.xml><?xml version="1.0" encoding="utf-8"?>
 <w:document xmlns:wpc="http://schemas.microsoft.com/office/word/2010/wordprocessingCanvas" xmlns:cx="http://schemas.microsoft.com/office/drawing/2014/chartex" xmlns:cx1="http://schemas.microsoft.com/office/drawing/2015/9/8/chartex" xmlns:cx2="http://schemas.microsoft.com/office/drawing/2015/10/21/chartex" xmlns:cx3="http://schemas.microsoft.com/office/drawing/2016/5/9/chartex" xmlns:cx4="http://schemas.microsoft.com/office/drawing/2016/5/10/chartex" xmlns:cx5="http://schemas.microsoft.com/office/drawing/2016/5/11/chartex" xmlns:cx6="http://schemas.microsoft.com/office/drawing/2016/5/12/chartex" xmlns:cx7="http://schemas.microsoft.com/office/drawing/2016/5/13/chartex" xmlns:cx8="http://schemas.microsoft.com/office/drawing/2016/5/14/chartex" xmlns:mc="http://schemas.openxmlformats.org/markup-compatibility/2006" xmlns:aink="http://schemas.microsoft.com/office/drawing/2016/ink" xmlns:am3d="http://schemas.microsoft.com/office/drawing/2017/model3d" xmlns:o="urn:schemas-microsoft-com:office:office" xmlns:oel="http://schemas.microsoft.com/office/2019/extlst" xmlns:r="http://schemas.openxmlformats.org/officeDocument/2006/relationships" xmlns:m="http://schemas.openxmlformats.org/officeDocument/2006/math" xmlns:v="urn:schemas-microsoft-com:vml" xmlns:wp14="http://schemas.microsoft.com/office/word/2010/wordprocessingDrawing" xmlns:wp="http://schemas.openxmlformats.org/drawingml/2006/wordprocessingDrawing" xmlns:w10="urn:schemas-microsoft-com:office:word" xmlns:w="http://schemas.openxmlformats.org/wordprocessingml/2006/main" xmlns:w14="http://schemas.microsoft.com/office/word/2010/wordml" xmlns:w15="http://schemas.microsoft.com/office/word/2012/wordml" xmlns:w16cex="http://schemas.microsoft.com/office/word/2018/wordml/cex" xmlns:w16cid="http://schemas.microsoft.com/office/word/2016/wordml/cid" xmlns:w16="http://schemas.microsoft.com/office/word/2018/wordml" xmlns:w16du="http://schemas.microsoft.com/office/word/2023/wordml/word16du" xmlns:w16sdtdh="http://schemas.microsoft.com/office/word/2020/wordml/sdtdatahash" xmlns:w16sdtfl="http://schemas.microsoft.com/office/word/2024/wordml/sdtformatlock" xmlns:w16se="http://schemas.microsoft.com/office/word/2015/wordml/symex" xmlns:wpg="http://schemas.microsoft.com/office/word/2010/wordprocessingGroup" xmlns:wpi="http://schemas.microsoft.com/office/word/2010/wordprocessingInk" xmlns:wne="http://schemas.microsoft.com/office/word/2006/wordml" xmlns:wps="http://schemas.microsoft.com/office/word/2010/wordprocessingShape" mc:Ignorable="w14 w15 w16se w16cid w16 w16cex w16sdtdh w16sdtfl w16du wp14">
   <w:body>
-    <w:p>
-      <w:r>
-        <w:t/>
-      </w:r>
-    </w:p>
     <w:tbl>
       <w:tblPr>
         <w:tblW w:w="10400" w:type="dxa"/>
@@ -55,7 +50,7 @@
                 <w:b/>
                 <w:sz w:val="22"/>
               </w:rPr>
-              <w:t xml:space="preserve">SỞ GIAO THÔNG VẬN TẢI TP.HCM</w:t>
+              <w:t>SỞ GIAO THÔNG VẬN TẢI TP.HCM</w:t>
             </w:r>
           </w:p>
           <w:p>
@@ -68,7 +63,7 @@
                 <w:rFonts w:ascii="Times New Roman" w:eastAsia="Times New Roman" w:hAnsi="Times New Roman"/>
                 <w:sz w:val="22"/>
               </w:rPr>
-              <w:t xml:space="preserve">HỘI ĐỒNG SÁT HẠCH</w:t>
+              <w:t>HỘI ĐỒNG SÁT HẠCH</w:t>
             </w:r>
           </w:p>
         </w:tc>
@@ -94,7 +89,7 @@
                 <w:b/>
                 <w:sz w:val="22"/>
               </w:rPr>
-              <w:t xml:space="preserve">CỘNG HÒA XÃ HỘI CHỦ NGHĨA VIỆT NAM</w:t>
+              <w:t>CỘNG HÒA XÃ HỘI CHỦ NGHĨA VIỆT NAM</w:t>
             </w:r>
           </w:p>
           <w:p>
@@ -108,7 +103,7 @@
                 <w:b/>
                 <w:sz w:val="22"/>
               </w:rPr>
-              <w:t xml:space="preserve">Độc lập - Tự do - Hạnh phúc</w:t>
+              <w:t>Độc lập - Tự do - Hạnh phúc</w:t>
             </w:r>
           </w:p>
         </w:tc>
@@ -125,19 +120,19 @@
           <w:b/>
           <w:sz w:val="30"/>
         </w:rPr>
-        <w:t xml:space="preserve">BIÊN BẢN SÁT HẠCH MÔ PHỎNG CÁC TÌNH HUỐNG GIAO THÔNG</w:t>
+        <w:t>BIÊN BẢN SÁT HẠCH MÔ PHỎNG CÁC TÌNH HUỐNG GIAO THÔNG</w:t>
       </w:r>
     </w:p>
     <w:tbl>
       <w:tblPr>
         <w:tblW w:w="10408" w:type="dxa"/>
         <w:tblBorders>
-          <w:top w:val="nil"/>
-          <w:left w:val="nil"/>
-          <w:bottom w:val="nil"/>
-          <w:right w:val="nil"/>
-          <w:insideH w:val="nil"/>
-          <w:insideV w:val="nil"/>
+          <w:top w:val="single" w:sz="4" w:space="0" w:color="auto"/>
+          <w:left w:val="single" w:sz="4" w:space="0" w:color="auto"/>
+          <w:bottom w:val="single" w:sz="4" w:space="0" w:color="auto"/>
+          <w:right w:val="single" w:sz="4" w:space="0" w:color="auto"/>
+          <w:insideH w:val="single" w:sz="4" w:space="0" w:color="auto"/>
+          <w:insideV w:val="single" w:sz="4" w:space="0" w:color="auto"/>
         </w:tblBorders>
         <w:tblLayout w:type="fixed"/>
         <w:tblCellMar>
@@ -174,6 +169,12 @@
           <w:tcPr>
             <w:tcW w:w="2650" w:type="dxa"/>
             <w:gridSpan w:val="4"/>
+            <w:tcBorders>
+              <w:top w:val="nil"/>
+              <w:left w:val="nil"/>
+              <w:bottom w:val="nil"/>
+              <w:right w:val="nil"/>
+            </w:tcBorders>
             <w:tcMar>
               <w:top w:w="45" w:type="dxa"/>
               <w:left w:w="45" w:type="dxa"/>
@@ -190,7 +191,7 @@
               <w:rPr>
                 <w:rFonts w:ascii="Times New Roman" w:eastAsia="Times New Roman" w:hAnsi="Times New Roman"/>
               </w:rPr>
-              <w:t xml:space="preserve">Họ và tên:</w:t>
+              <w:t>Họ và tên:</w:t>
             </w:r>
           </w:p>
         </w:tc>
@@ -198,6 +199,12 @@
           <w:tcPr>
             <w:tcW w:w="4850" w:type="dxa"/>
             <w:gridSpan w:val="6"/>
+            <w:tcBorders>
+              <w:top w:val="nil"/>
+              <w:left w:val="nil"/>
+              <w:bottom w:val="nil"/>
+              <w:right w:val="nil"/>
+            </w:tcBorders>
             <w:tcMar>
               <w:top w:w="45" w:type="dxa"/>
               <w:left w:w="45" w:type="dxa"/>
@@ -215,7 +222,7 @@
                 <w:rFonts w:ascii="Times New Roman" w:eastAsia="Times New Roman" w:hAnsi="Times New Roman"/>
                 <w:b/>
               </w:rPr>
-              <w:t xml:space="preserve">{{simulation_full_name}}</w:t>
+              <w:t>{{simulation_full_name}}</w:t>
             </w:r>
           </w:p>
         </w:tc>
@@ -224,6 +231,12 @@
             <w:tcW w:w="2900" w:type="dxa"/>
             <w:gridSpan w:val="4"/>
             <w:vMerge w:val="restart"/>
+            <w:tcBorders>
+              <w:top w:val="nil"/>
+              <w:left w:val="nil"/>
+              <w:bottom w:val="nil"/>
+              <w:right w:val="nil"/>
+            </w:tcBorders>
             <w:tcMar>
               <w:top w:w="0" w:type="dxa"/>
               <w:left w:w="0" w:type="dxa"/>
@@ -237,7 +250,6 @@
               <w:jc w:val="center"/>
             </w:pPr>
             <w:r>
-              <w:rPr/>
               <w:t>{{%simulation_image}}</w:t>
             </w:r>
           </w:p>
@@ -254,6 +266,12 @@
           <w:tcPr>
             <w:tcW w:w="2650" w:type="dxa"/>
             <w:gridSpan w:val="4"/>
+            <w:tcBorders>
+              <w:top w:val="nil"/>
+              <w:left w:val="nil"/>
+              <w:bottom w:val="nil"/>
+              <w:right w:val="nil"/>
+            </w:tcBorders>
             <w:tcMar>
               <w:top w:w="45" w:type="dxa"/>
               <w:left w:w="45" w:type="dxa"/>
@@ -270,7 +288,7 @@
               <w:rPr>
                 <w:rFonts w:ascii="Times New Roman" w:eastAsia="Times New Roman" w:hAnsi="Times New Roman"/>
               </w:rPr>
-              <w:t xml:space="preserve">Ngày sinh:</w:t>
+              <w:t>Ngày sinh:</w:t>
             </w:r>
           </w:p>
         </w:tc>
@@ -278,6 +296,12 @@
           <w:tcPr>
             <w:tcW w:w="4850" w:type="dxa"/>
             <w:gridSpan w:val="6"/>
+            <w:tcBorders>
+              <w:top w:val="nil"/>
+              <w:left w:val="nil"/>
+              <w:bottom w:val="nil"/>
+              <w:right w:val="nil"/>
+            </w:tcBorders>
             <w:tcMar>
               <w:top w:w="45" w:type="dxa"/>
               <w:left w:w="45" w:type="dxa"/>
@@ -295,7 +319,7 @@
                 <w:rFonts w:ascii="Times New Roman" w:eastAsia="Times New Roman" w:hAnsi="Times New Roman"/>
                 <w:b/>
               </w:rPr>
-              <w:t xml:space="preserve">{{simulation_birthday}}</w:t>
+              <w:t>{{simulation_birthday}}</w:t>
             </w:r>
           </w:p>
         </w:tc>
@@ -304,6 +328,12 @@
             <w:tcW w:w="2900" w:type="dxa"/>
             <w:gridSpan w:val="4"/>
             <w:vMerge/>
+            <w:tcBorders>
+              <w:top w:val="nil"/>
+              <w:left w:val="nil"/>
+              <w:bottom w:val="nil"/>
+              <w:right w:val="nil"/>
+            </w:tcBorders>
             <w:tcMar>
               <w:top w:w="0" w:type="dxa"/>
               <w:left w:w="0" w:type="dxa"/>
@@ -330,6 +360,12 @@
           <w:tcPr>
             <w:tcW w:w="2650" w:type="dxa"/>
             <w:gridSpan w:val="4"/>
+            <w:tcBorders>
+              <w:top w:val="nil"/>
+              <w:left w:val="nil"/>
+              <w:bottom w:val="nil"/>
+              <w:right w:val="nil"/>
+            </w:tcBorders>
             <w:tcMar>
               <w:top w:w="45" w:type="dxa"/>
               <w:left w:w="45" w:type="dxa"/>
@@ -346,7 +382,7 @@
               <w:rPr>
                 <w:rFonts w:ascii="Times New Roman" w:eastAsia="Times New Roman" w:hAnsi="Times New Roman"/>
               </w:rPr>
-              <w:t xml:space="preserve">Số CCCD:</w:t>
+              <w:t>Số CCCD:</w:t>
             </w:r>
           </w:p>
         </w:tc>
@@ -354,6 +390,12 @@
           <w:tcPr>
             <w:tcW w:w="4850" w:type="dxa"/>
             <w:gridSpan w:val="6"/>
+            <w:tcBorders>
+              <w:top w:val="nil"/>
+              <w:left w:val="nil"/>
+              <w:bottom w:val="nil"/>
+              <w:right w:val="nil"/>
+            </w:tcBorders>
             <w:tcMar>
               <w:top w:w="45" w:type="dxa"/>
               <w:left w:w="45" w:type="dxa"/>
@@ -371,7 +413,7 @@
                 <w:rFonts w:ascii="Times New Roman" w:eastAsia="Times New Roman" w:hAnsi="Times New Roman"/>
                 <w:b/>
               </w:rPr>
-              <w:t xml:space="preserve">{{simulation_identity_card}}</w:t>
+              <w:t>{{simulation_identity_card}}</w:t>
             </w:r>
           </w:p>
         </w:tc>
@@ -380,6 +422,12 @@
             <w:tcW w:w="2900" w:type="dxa"/>
             <w:gridSpan w:val="4"/>
             <w:vMerge/>
+            <w:tcBorders>
+              <w:top w:val="nil"/>
+              <w:left w:val="nil"/>
+              <w:bottom w:val="nil"/>
+              <w:right w:val="nil"/>
+            </w:tcBorders>
             <w:tcMar>
               <w:top w:w="0" w:type="dxa"/>
               <w:left w:w="0" w:type="dxa"/>
@@ -406,6 +454,12 @@
           <w:tcPr>
             <w:tcW w:w="2650" w:type="dxa"/>
             <w:gridSpan w:val="4"/>
+            <w:tcBorders>
+              <w:top w:val="nil"/>
+              <w:left w:val="nil"/>
+              <w:bottom w:val="nil"/>
+              <w:right w:val="nil"/>
+            </w:tcBorders>
             <w:tcMar>
               <w:top w:w="45" w:type="dxa"/>
               <w:left w:w="45" w:type="dxa"/>
@@ -422,7 +476,7 @@
               <w:rPr>
                 <w:rFonts w:ascii="Times New Roman" w:eastAsia="Times New Roman" w:hAnsi="Times New Roman"/>
               </w:rPr>
-              <w:t xml:space="preserve">Hạng:</w:t>
+              <w:t>Hạng:</w:t>
             </w:r>
           </w:p>
         </w:tc>
@@ -430,6 +484,12 @@
           <w:tcPr>
             <w:tcW w:w="4850" w:type="dxa"/>
             <w:gridSpan w:val="6"/>
+            <w:tcBorders>
+              <w:top w:val="nil"/>
+              <w:left w:val="nil"/>
+              <w:bottom w:val="nil"/>
+              <w:right w:val="nil"/>
+            </w:tcBorders>
             <w:tcMar>
               <w:top w:w="45" w:type="dxa"/>
               <w:left w:w="45" w:type="dxa"/>
@@ -447,7 +507,7 @@
                 <w:rFonts w:ascii="Times New Roman" w:eastAsia="Times New Roman" w:hAnsi="Times New Roman"/>
                 <w:b/>
               </w:rPr>
-              <w:t xml:space="preserve">{{simulation_license_type}}</w:t>
+              <w:t>{{simulation_license_type}}</w:t>
             </w:r>
           </w:p>
         </w:tc>
@@ -456,6 +516,12 @@
             <w:tcW w:w="2900" w:type="dxa"/>
             <w:gridSpan w:val="4"/>
             <w:vMerge/>
+            <w:tcBorders>
+              <w:top w:val="nil"/>
+              <w:left w:val="nil"/>
+              <w:bottom w:val="nil"/>
+              <w:right w:val="nil"/>
+            </w:tcBorders>
             <w:tcMar>
               <w:top w:w="0" w:type="dxa"/>
               <w:left w:w="0" w:type="dxa"/>
@@ -482,6 +548,12 @@
           <w:tcPr>
             <w:tcW w:w="2650" w:type="dxa"/>
             <w:gridSpan w:val="4"/>
+            <w:tcBorders>
+              <w:top w:val="nil"/>
+              <w:left w:val="nil"/>
+              <w:bottom w:val="nil"/>
+              <w:right w:val="nil"/>
+            </w:tcBorders>
             <w:tcMar>
               <w:top w:w="45" w:type="dxa"/>
               <w:left w:w="45" w:type="dxa"/>
@@ -498,7 +570,7 @@
               <w:rPr>
                 <w:rFonts w:ascii="Times New Roman" w:eastAsia="Times New Roman" w:hAnsi="Times New Roman"/>
               </w:rPr>
-              <w:t xml:space="preserve">Số báo danh:</w:t>
+              <w:t>Số báo danh:</w:t>
             </w:r>
           </w:p>
         </w:tc>
@@ -506,6 +578,12 @@
           <w:tcPr>
             <w:tcW w:w="4850" w:type="dxa"/>
             <w:gridSpan w:val="6"/>
+            <w:tcBorders>
+              <w:top w:val="nil"/>
+              <w:left w:val="nil"/>
+              <w:bottom w:val="nil"/>
+              <w:right w:val="nil"/>
+            </w:tcBorders>
             <w:tcMar>
               <w:top w:w="45" w:type="dxa"/>
               <w:left w:w="45" w:type="dxa"/>
@@ -523,7 +601,7 @@
                 <w:rFonts w:ascii="Times New Roman" w:eastAsia="Times New Roman" w:hAnsi="Times New Roman"/>
                 <w:b/>
               </w:rPr>
-              <w:t xml:space="preserve">{{simulation_no}}</w:t>
+              <w:t>{{simulation_no}}</w:t>
             </w:r>
           </w:p>
         </w:tc>
@@ -532,6 +610,12 @@
             <w:tcW w:w="2900" w:type="dxa"/>
             <w:gridSpan w:val="4"/>
             <w:vMerge/>
+            <w:tcBorders>
+              <w:top w:val="nil"/>
+              <w:left w:val="nil"/>
+              <w:bottom w:val="nil"/>
+              <w:right w:val="nil"/>
+            </w:tcBorders>
             <w:tcMar>
               <w:top w:w="0" w:type="dxa"/>
               <w:left w:w="0" w:type="dxa"/>
@@ -558,6 +642,12 @@
           <w:tcPr>
             <w:tcW w:w="2650" w:type="dxa"/>
             <w:gridSpan w:val="4"/>
+            <w:tcBorders>
+              <w:top w:val="nil"/>
+              <w:left w:val="nil"/>
+              <w:bottom w:val="nil"/>
+              <w:right w:val="nil"/>
+            </w:tcBorders>
             <w:tcMar>
               <w:top w:w="45" w:type="dxa"/>
               <w:left w:w="45" w:type="dxa"/>
@@ -574,7 +664,7 @@
               <w:rPr>
                 <w:rFonts w:ascii="Times New Roman" w:eastAsia="Times New Roman" w:hAnsi="Times New Roman"/>
               </w:rPr>
-              <w:t xml:space="preserve">Khóa sát hạch:</w:t>
+              <w:t>Khóa sát hạch:</w:t>
             </w:r>
           </w:p>
         </w:tc>
@@ -582,6 +672,12 @@
           <w:tcPr>
             <w:tcW w:w="4850" w:type="dxa"/>
             <w:gridSpan w:val="6"/>
+            <w:tcBorders>
+              <w:top w:val="nil"/>
+              <w:left w:val="nil"/>
+              <w:bottom w:val="nil"/>
+              <w:right w:val="nil"/>
+            </w:tcBorders>
             <w:tcMar>
               <w:top w:w="45" w:type="dxa"/>
               <w:left w:w="45" w:type="dxa"/>
@@ -599,7 +695,7 @@
                 <w:rFonts w:ascii="Times New Roman" w:eastAsia="Times New Roman" w:hAnsi="Times New Roman"/>
                 <w:b/>
               </w:rPr>
-              <w:t xml:space="preserve">{{simulation_course}}</w:t>
+              <w:t>{{simulation_course}}</w:t>
             </w:r>
           </w:p>
         </w:tc>
@@ -607,7 +703,13 @@
           <w:tcPr>
             <w:tcW w:w="2900" w:type="dxa"/>
             <w:gridSpan w:val="4"/>
-            <w:vMerge/>
+            <w:vMerge w:val="restart"/>
+            <w:tcBorders>
+              <w:top w:val="nil"/>
+              <w:left w:val="nil"/>
+              <w:bottom w:val="nil"/>
+              <w:right w:val="nil"/>
+            </w:tcBorders>
             <w:tcMar>
               <w:top w:w="0" w:type="dxa"/>
               <w:left w:w="0" w:type="dxa"/>
@@ -634,6 +736,12 @@
           <w:tcPr>
             <w:tcW w:w="2650" w:type="dxa"/>
             <w:gridSpan w:val="4"/>
+            <w:tcBorders>
+              <w:top w:val="nil"/>
+              <w:left w:val="nil"/>
+              <w:bottom w:val="nil"/>
+              <w:right w:val="nil"/>
+            </w:tcBorders>
             <w:tcMar>
               <w:top w:w="45" w:type="dxa"/>
               <w:left w:w="45" w:type="dxa"/>
@@ -650,7 +758,7 @@
               <w:rPr>
                 <w:rFonts w:ascii="Times New Roman" w:eastAsia="Times New Roman" w:hAnsi="Times New Roman"/>
               </w:rPr>
-              <w:t xml:space="preserve">Ngày sát hạch:</w:t>
+              <w:t>Ngày sát hạch:</w:t>
             </w:r>
           </w:p>
         </w:tc>
@@ -658,6 +766,12 @@
           <w:tcPr>
             <w:tcW w:w="4850" w:type="dxa"/>
             <w:gridSpan w:val="6"/>
+            <w:tcBorders>
+              <w:top w:val="nil"/>
+              <w:left w:val="nil"/>
+              <w:bottom w:val="nil"/>
+              <w:right w:val="nil"/>
+            </w:tcBorders>
             <w:tcMar>
               <w:top w:w="45" w:type="dxa"/>
               <w:left w:w="45" w:type="dxa"/>
@@ -675,7 +789,7 @@
                 <w:rFonts w:ascii="Times New Roman" w:eastAsia="Times New Roman" w:hAnsi="Times New Roman"/>
                 <w:b/>
               </w:rPr>
-              <w:t xml:space="preserve">{{simulation_exam_date}}</w:t>
+              <w:t>{{simulation_exam_date}}</w:t>
             </w:r>
           </w:p>
         </w:tc>
@@ -684,6 +798,12 @@
             <w:tcW w:w="2900" w:type="dxa"/>
             <w:gridSpan w:val="4"/>
             <w:vMerge/>
+            <w:tcBorders>
+              <w:top w:val="nil"/>
+              <w:left w:val="nil"/>
+              <w:bottom w:val="nil"/>
+              <w:right w:val="nil"/>
+            </w:tcBorders>
             <w:tcMar>
               <w:top w:w="0" w:type="dxa"/>
               <w:left w:w="0" w:type="dxa"/>
@@ -710,6 +830,12 @@
           <w:tcPr>
             <w:tcW w:w="2650" w:type="dxa"/>
             <w:gridSpan w:val="4"/>
+            <w:tcBorders>
+              <w:top w:val="nil"/>
+              <w:left w:val="nil"/>
+              <w:bottom w:val="nil"/>
+              <w:right w:val="nil"/>
+            </w:tcBorders>
             <w:tcMar>
               <w:top w:w="45" w:type="dxa"/>
               <w:left w:w="45" w:type="dxa"/>
@@ -726,7 +852,7 @@
               <w:rPr>
                 <w:rFonts w:ascii="Times New Roman" w:eastAsia="Times New Roman" w:hAnsi="Times New Roman"/>
               </w:rPr>
-              <w:t xml:space="preserve">Thời điểm bắt đầu:</w:t>
+              <w:t>Thời điểm bắt đầu:</w:t>
             </w:r>
           </w:p>
         </w:tc>
@@ -734,6 +860,12 @@
           <w:tcPr>
             <w:tcW w:w="4850" w:type="dxa"/>
             <w:gridSpan w:val="6"/>
+            <w:tcBorders>
+              <w:top w:val="nil"/>
+              <w:left w:val="nil"/>
+              <w:bottom w:val="nil"/>
+              <w:right w:val="nil"/>
+            </w:tcBorders>
             <w:tcMar>
               <w:top w:w="45" w:type="dxa"/>
               <w:left w:w="45" w:type="dxa"/>
@@ -759,6 +891,12 @@
             <w:tcW w:w="2900" w:type="dxa"/>
             <w:gridSpan w:val="4"/>
             <w:vMerge/>
+            <w:tcBorders>
+              <w:top w:val="nil"/>
+              <w:left w:val="nil"/>
+              <w:bottom w:val="nil"/>
+              <w:right w:val="nil"/>
+            </w:tcBorders>
             <w:tcMar>
               <w:top w:w="0" w:type="dxa"/>
               <w:left w:w="0" w:type="dxa"/>
@@ -785,6 +923,12 @@
           <w:tcPr>
             <w:tcW w:w="2650" w:type="dxa"/>
             <w:gridSpan w:val="4"/>
+            <w:tcBorders>
+              <w:top w:val="nil"/>
+              <w:left w:val="nil"/>
+              <w:bottom w:val="nil"/>
+              <w:right w:val="nil"/>
+            </w:tcBorders>
             <w:tcMar>
               <w:top w:w="45" w:type="dxa"/>
               <w:left w:w="45" w:type="dxa"/>
@@ -801,7 +945,7 @@
               <w:rPr>
                 <w:rFonts w:ascii="Times New Roman" w:eastAsia="Times New Roman" w:hAnsi="Times New Roman"/>
               </w:rPr>
-              <w:t xml:space="preserve">Thời điểm kết thúc:</w:t>
+              <w:t>Thời điểm kết thúc:</w:t>
             </w:r>
           </w:p>
         </w:tc>
@@ -809,6 +953,12 @@
           <w:tcPr>
             <w:tcW w:w="4850" w:type="dxa"/>
             <w:gridSpan w:val="6"/>
+            <w:tcBorders>
+              <w:top w:val="nil"/>
+              <w:left w:val="nil"/>
+              <w:bottom w:val="nil"/>
+              <w:right w:val="nil"/>
+            </w:tcBorders>
             <w:tcMar>
               <w:top w:w="45" w:type="dxa"/>
               <w:left w:w="45" w:type="dxa"/>
@@ -834,6 +984,12 @@
             <w:tcW w:w="2900" w:type="dxa"/>
             <w:gridSpan w:val="4"/>
             <w:vMerge/>
+            <w:tcBorders>
+              <w:top w:val="nil"/>
+              <w:left w:val="nil"/>
+              <w:bottom w:val="nil"/>
+              <w:right w:val="nil"/>
+            </w:tcBorders>
             <w:tcMar>
               <w:top w:w="0" w:type="dxa"/>
               <w:left w:w="0" w:type="dxa"/>
@@ -860,6 +1016,12 @@
           <w:tcPr>
             <w:tcW w:w="2650" w:type="dxa"/>
             <w:gridSpan w:val="4"/>
+            <w:tcBorders>
+              <w:top w:val="nil"/>
+              <w:left w:val="nil"/>
+              <w:bottom w:val="nil"/>
+              <w:right w:val="nil"/>
+            </w:tcBorders>
             <w:tcMar>
               <w:top w:w="45" w:type="dxa"/>
               <w:left w:w="45" w:type="dxa"/>
@@ -876,7 +1038,7 @@
               <w:rPr>
                 <w:rFonts w:ascii="Times New Roman" w:eastAsia="Times New Roman" w:hAnsi="Times New Roman"/>
               </w:rPr>
-              <w:t xml:space="preserve">Lần thi:</w:t>
+              <w:t>Lần thi:</w:t>
             </w:r>
           </w:p>
         </w:tc>
@@ -884,6 +1046,12 @@
           <w:tcPr>
             <w:tcW w:w="4850" w:type="dxa"/>
             <w:gridSpan w:val="6"/>
+            <w:tcBorders>
+              <w:top w:val="nil"/>
+              <w:left w:val="nil"/>
+              <w:bottom w:val="nil"/>
+              <w:right w:val="nil"/>
+            </w:tcBorders>
             <w:tcMar>
               <w:top w:w="45" w:type="dxa"/>
               <w:left w:w="45" w:type="dxa"/>
@@ -909,6 +1077,12 @@
             <w:tcW w:w="2900" w:type="dxa"/>
             <w:gridSpan w:val="4"/>
             <w:vMerge/>
+            <w:tcBorders>
+              <w:top w:val="nil"/>
+              <w:left w:val="nil"/>
+              <w:bottom w:val="nil"/>
+              <w:right w:val="nil"/>
+            </w:tcBorders>
             <w:tcMar>
               <w:top w:w="0" w:type="dxa"/>
               <w:left w:w="0" w:type="dxa"/>
@@ -925,16 +1099,6 @@
         </w:tc>
       </w:tr>
       <w:tr>
-        <w:tblPrEx>
-          <w:tblBorders>
-            <w:top w:val="single" w:sz="6" w:space="0" w:color="auto"/>
-            <w:left w:val="single" w:sz="6" w:space="0" w:color="auto"/>
-            <w:bottom w:val="single" w:sz="6" w:space="0" w:color="auto"/>
-            <w:right w:val="single" w:sz="6" w:space="0" w:color="auto"/>
-            <w:insideH w:val="single" w:sz="6" w:space="0" w:color="auto"/>
-            <w:insideV w:val="single" w:sz="6" w:space="0" w:color="auto"/>
-          </w:tblBorders>
-        </w:tblPrEx>
         <w:trPr>
           <w:gridBefore w:val="1"/>
           <w:wBefore w:w="8" w:type="dxa"/>
@@ -944,12 +1108,6 @@
         <w:tc>
           <w:tcPr>
             <w:tcW w:w="1450" w:type="dxa"/>
-            <w:tcBorders>
-              <w:top w:val="single" w:sz="6" w:space="0" w:color="auto"/>
-              <w:left w:val="single" w:sz="6" w:space="0" w:color="auto"/>
-              <w:bottom w:val="single" w:sz="6" w:space="0" w:color="auto"/>
-              <w:right w:val="single" w:sz="6" w:space="0" w:color="auto"/>
-            </w:tcBorders>
             <w:tcMar>
               <w:top w:w="30" w:type="dxa"/>
               <w:left w:w="30" w:type="dxa"/>
@@ -974,19 +1132,13 @@
                 <w:rFonts w:ascii="Times New Roman" w:eastAsia="Times New Roman" w:hAnsi="Times New Roman"/>
                 <w:b/>
               </w:rPr>
-              <w:t xml:space="preserve">Câu hỏi</w:t>
+              <w:t>Câu hỏi</w:t>
             </w:r>
           </w:p>
         </w:tc>
         <w:tc>
           <w:tcPr>
             <w:tcW w:w="895" w:type="dxa"/>
-            <w:tcBorders>
-              <w:top w:val="single" w:sz="6" w:space="0" w:color="auto"/>
-              <w:left w:val="single" w:sz="6" w:space="0" w:color="auto"/>
-              <w:bottom w:val="single" w:sz="6" w:space="0" w:color="auto"/>
-              <w:right w:val="single" w:sz="6" w:space="0" w:color="auto"/>
-            </w:tcBorders>
             <w:tcMar>
               <w:top w:w="30" w:type="dxa"/>
               <w:left w:w="30" w:type="dxa"/>
@@ -1005,7 +1157,7 @@
                 <w:rFonts w:ascii="Times New Roman" w:eastAsia="Times New Roman" w:hAnsi="Times New Roman"/>
                 <w:b/>
               </w:rPr>
-              <w:t xml:space="preserve">1</w:t>
+              <w:t>1</w:t>
             </w:r>
           </w:p>
         </w:tc>
@@ -1013,12 +1165,6 @@
           <w:tcPr>
             <w:tcW w:w="895" w:type="dxa"/>
             <w:gridSpan w:val="2"/>
-            <w:tcBorders>
-              <w:top w:val="single" w:sz="6" w:space="0" w:color="auto"/>
-              <w:left w:val="single" w:sz="6" w:space="0" w:color="auto"/>
-              <w:bottom w:val="single" w:sz="6" w:space="0" w:color="auto"/>
-              <w:right w:val="single" w:sz="6" w:space="0" w:color="auto"/>
-            </w:tcBorders>
             <w:tcMar>
               <w:top w:w="30" w:type="dxa"/>
               <w:left w:w="30" w:type="dxa"/>
@@ -1037,19 +1183,13 @@
                 <w:rFonts w:ascii="Times New Roman" w:eastAsia="Times New Roman" w:hAnsi="Times New Roman"/>
                 <w:b/>
               </w:rPr>
-              <w:t xml:space="preserve">2</w:t>
+              <w:t>2</w:t>
             </w:r>
           </w:p>
         </w:tc>
         <w:tc>
           <w:tcPr>
             <w:tcW w:w="895" w:type="dxa"/>
-            <w:tcBorders>
-              <w:top w:val="single" w:sz="6" w:space="0" w:color="auto"/>
-              <w:left w:val="single" w:sz="6" w:space="0" w:color="auto"/>
-              <w:bottom w:val="single" w:sz="6" w:space="0" w:color="auto"/>
-              <w:right w:val="single" w:sz="6" w:space="0" w:color="auto"/>
-            </w:tcBorders>
             <w:tcMar>
               <w:top w:w="30" w:type="dxa"/>
               <w:left w:w="30" w:type="dxa"/>
@@ -1068,19 +1208,13 @@
                 <w:rFonts w:ascii="Times New Roman" w:eastAsia="Times New Roman" w:hAnsi="Times New Roman"/>
                 <w:b/>
               </w:rPr>
-              <w:t xml:space="preserve">3</w:t>
+              <w:t>3</w:t>
             </w:r>
           </w:p>
         </w:tc>
         <w:tc>
           <w:tcPr>
             <w:tcW w:w="895" w:type="dxa"/>
-            <w:tcBorders>
-              <w:top w:val="single" w:sz="6" w:space="0" w:color="auto"/>
-              <w:left w:val="single" w:sz="6" w:space="0" w:color="auto"/>
-              <w:bottom w:val="single" w:sz="6" w:space="0" w:color="auto"/>
-              <w:right w:val="single" w:sz="6" w:space="0" w:color="auto"/>
-            </w:tcBorders>
             <w:tcMar>
               <w:top w:w="30" w:type="dxa"/>
               <w:left w:w="30" w:type="dxa"/>
@@ -1099,19 +1233,13 @@
                 <w:rFonts w:ascii="Times New Roman" w:eastAsia="Times New Roman" w:hAnsi="Times New Roman"/>
                 <w:b/>
               </w:rPr>
-              <w:t xml:space="preserve">4</w:t>
+              <w:t>4</w:t>
             </w:r>
           </w:p>
         </w:tc>
         <w:tc>
           <w:tcPr>
             <w:tcW w:w="895" w:type="dxa"/>
-            <w:tcBorders>
-              <w:top w:val="single" w:sz="6" w:space="0" w:color="auto"/>
-              <w:left w:val="single" w:sz="6" w:space="0" w:color="auto"/>
-              <w:bottom w:val="single" w:sz="6" w:space="0" w:color="auto"/>
-              <w:right w:val="single" w:sz="6" w:space="0" w:color="auto"/>
-            </w:tcBorders>
             <w:tcMar>
               <w:top w:w="30" w:type="dxa"/>
               <w:left w:w="30" w:type="dxa"/>
@@ -1130,19 +1258,13 @@
                 <w:rFonts w:ascii="Times New Roman" w:eastAsia="Times New Roman" w:hAnsi="Times New Roman"/>
                 <w:b/>
               </w:rPr>
-              <w:t xml:space="preserve">5</w:t>
+              <w:t>5</w:t>
             </w:r>
           </w:p>
         </w:tc>
         <w:tc>
           <w:tcPr>
             <w:tcW w:w="895" w:type="dxa"/>
-            <w:tcBorders>
-              <w:top w:val="single" w:sz="6" w:space="0" w:color="auto"/>
-              <w:left w:val="single" w:sz="6" w:space="0" w:color="auto"/>
-              <w:bottom w:val="single" w:sz="6" w:space="0" w:color="auto"/>
-              <w:right w:val="single" w:sz="6" w:space="0" w:color="auto"/>
-            </w:tcBorders>
             <w:tcMar>
               <w:top w:w="30" w:type="dxa"/>
               <w:left w:w="30" w:type="dxa"/>
@@ -1161,7 +1283,7 @@
                 <w:rFonts w:ascii="Times New Roman" w:eastAsia="Times New Roman" w:hAnsi="Times New Roman"/>
                 <w:b/>
               </w:rPr>
-              <w:t xml:space="preserve">6</w:t>
+              <w:t>6</w:t>
             </w:r>
           </w:p>
         </w:tc>
@@ -1169,12 +1291,6 @@
           <w:tcPr>
             <w:tcW w:w="895" w:type="dxa"/>
             <w:gridSpan w:val="2"/>
-            <w:tcBorders>
-              <w:top w:val="single" w:sz="6" w:space="0" w:color="auto"/>
-              <w:left w:val="single" w:sz="6" w:space="0" w:color="auto"/>
-              <w:bottom w:val="single" w:sz="6" w:space="0" w:color="auto"/>
-              <w:right w:val="single" w:sz="6" w:space="0" w:color="auto"/>
-            </w:tcBorders>
             <w:tcMar>
               <w:top w:w="30" w:type="dxa"/>
               <w:left w:w="30" w:type="dxa"/>
@@ -1193,19 +1309,13 @@
                 <w:rFonts w:ascii="Times New Roman" w:eastAsia="Times New Roman" w:hAnsi="Times New Roman"/>
                 <w:b/>
               </w:rPr>
-              <w:t xml:space="preserve">7</w:t>
+              <w:t>7</w:t>
             </w:r>
           </w:p>
         </w:tc>
         <w:tc>
           <w:tcPr>
             <w:tcW w:w="895" w:type="dxa"/>
-            <w:tcBorders>
-              <w:top w:val="single" w:sz="6" w:space="0" w:color="auto"/>
-              <w:left w:val="single" w:sz="6" w:space="0" w:color="auto"/>
-              <w:bottom w:val="single" w:sz="6" w:space="0" w:color="auto"/>
-              <w:right w:val="single" w:sz="6" w:space="0" w:color="auto"/>
-            </w:tcBorders>
             <w:tcMar>
               <w:top w:w="30" w:type="dxa"/>
               <w:left w:w="30" w:type="dxa"/>
@@ -1224,19 +1334,13 @@
                 <w:rFonts w:ascii="Times New Roman" w:eastAsia="Times New Roman" w:hAnsi="Times New Roman"/>
                 <w:b/>
               </w:rPr>
-              <w:t xml:space="preserve">8</w:t>
+              <w:t>8</w:t>
             </w:r>
           </w:p>
         </w:tc>
         <w:tc>
           <w:tcPr>
             <w:tcW w:w="895" w:type="dxa"/>
-            <w:tcBorders>
-              <w:top w:val="single" w:sz="6" w:space="0" w:color="auto"/>
-              <w:left w:val="single" w:sz="6" w:space="0" w:color="auto"/>
-              <w:bottom w:val="single" w:sz="6" w:space="0" w:color="auto"/>
-              <w:right w:val="single" w:sz="6" w:space="0" w:color="auto"/>
-            </w:tcBorders>
             <w:tcMar>
               <w:top w:w="30" w:type="dxa"/>
               <w:left w:w="30" w:type="dxa"/>
@@ -1255,7 +1359,7 @@
                 <w:rFonts w:ascii="Times New Roman" w:eastAsia="Times New Roman" w:hAnsi="Times New Roman"/>
                 <w:b/>
               </w:rPr>
-              <w:t xml:space="preserve">9</w:t>
+              <w:t>9</w:t>
             </w:r>
           </w:p>
         </w:tc>
@@ -1263,12 +1367,6 @@
           <w:tcPr>
             <w:tcW w:w="895" w:type="dxa"/>
             <w:gridSpan w:val="2"/>
-            <w:tcBorders>
-              <w:top w:val="single" w:sz="6" w:space="0" w:color="auto"/>
-              <w:left w:val="single" w:sz="6" w:space="0" w:color="auto"/>
-              <w:bottom w:val="single" w:sz="6" w:space="0" w:color="auto"/>
-              <w:right w:val="single" w:sz="6" w:space="0" w:color="auto"/>
-            </w:tcBorders>
             <w:tcMar>
               <w:top w:w="30" w:type="dxa"/>
               <w:left w:w="30" w:type="dxa"/>
@@ -1287,22 +1385,12 @@
                 <w:rFonts w:ascii="Times New Roman" w:eastAsia="Times New Roman" w:hAnsi="Times New Roman"/>
                 <w:b/>
               </w:rPr>
-              <w:t xml:space="preserve">10</w:t>
+              <w:t>10</w:t>
             </w:r>
           </w:p>
         </w:tc>
       </w:tr>
       <w:tr>
-        <w:tblPrEx>
-          <w:tblBorders>
-            <w:top w:val="single" w:sz="6" w:space="0" w:color="auto"/>
-            <w:left w:val="single" w:sz="6" w:space="0" w:color="auto"/>
-            <w:bottom w:val="single" w:sz="6" w:space="0" w:color="auto"/>
-            <w:right w:val="single" w:sz="6" w:space="0" w:color="auto"/>
-            <w:insideH w:val="single" w:sz="6" w:space="0" w:color="auto"/>
-            <w:insideV w:val="single" w:sz="6" w:space="0" w:color="auto"/>
-          </w:tblBorders>
-        </w:tblPrEx>
         <w:trPr>
           <w:gridBefore w:val="1"/>
           <w:wBefore w:w="8" w:type="dxa"/>
@@ -1312,12 +1400,6 @@
         <w:tc>
           <w:tcPr>
             <w:tcW w:w="1450" w:type="dxa"/>
-            <w:tcBorders>
-              <w:top w:val="single" w:sz="6" w:space="0" w:color="auto"/>
-              <w:left w:val="single" w:sz="6" w:space="0" w:color="auto"/>
-              <w:bottom w:val="single" w:sz="6" w:space="0" w:color="auto"/>
-              <w:right w:val="single" w:sz="6" w:space="0" w:color="auto"/>
-            </w:tcBorders>
             <w:tcMar>
               <w:top w:w="30" w:type="dxa"/>
               <w:left w:w="30" w:type="dxa"/>
@@ -1335,19 +1417,19 @@
               <w:rPr>
                 <w:rFonts w:ascii="Times New Roman" w:eastAsia="Times New Roman" w:hAnsi="Times New Roman"/>
               </w:rPr>
-              <w:t xml:space="preserve">Diểm</w:t>
+              <w:t>Đ</w:t>
+            </w:r>
+            <w:r>
+              <w:rPr>
+                <w:rFonts w:ascii="Times New Roman" w:eastAsia="Times New Roman" w:hAnsi="Times New Roman"/>
+              </w:rPr>
+              <w:t>iểm</w:t>
             </w:r>
           </w:p>
         </w:tc>
         <w:tc>
           <w:tcPr>
             <w:tcW w:w="895" w:type="dxa"/>
-            <w:tcBorders>
-              <w:top w:val="single" w:sz="6" w:space="0" w:color="auto"/>
-              <w:left w:val="single" w:sz="6" w:space="0" w:color="auto"/>
-              <w:bottom w:val="single" w:sz="6" w:space="0" w:color="auto"/>
-              <w:right w:val="single" w:sz="6" w:space="0" w:color="auto"/>
-            </w:tcBorders>
             <w:tcMar>
               <w:top w:w="30" w:type="dxa"/>
               <w:left w:w="30" w:type="dxa"/>
@@ -1365,7 +1447,7 @@
               <w:rPr>
                 <w:rFonts w:ascii="Times New Roman" w:eastAsia="Times New Roman" w:hAnsi="Times New Roman"/>
               </w:rPr>
-              <w:t xml:space="preserve">{{simulation_question_1}}</w:t>
+              <w:t>{{simulation_question_1}}</w:t>
             </w:r>
           </w:p>
         </w:tc>
@@ -1373,12 +1455,6 @@
           <w:tcPr>
             <w:tcW w:w="895" w:type="dxa"/>
             <w:gridSpan w:val="2"/>
-            <w:tcBorders>
-              <w:top w:val="single" w:sz="6" w:space="0" w:color="auto"/>
-              <w:left w:val="single" w:sz="6" w:space="0" w:color="auto"/>
-              <w:bottom w:val="single" w:sz="6" w:space="0" w:color="auto"/>
-              <w:right w:val="single" w:sz="6" w:space="0" w:color="auto"/>
-            </w:tcBorders>
             <w:tcMar>
               <w:top w:w="30" w:type="dxa"/>
               <w:left w:w="30" w:type="dxa"/>
@@ -1396,19 +1472,13 @@
               <w:rPr>
                 <w:rFonts w:ascii="Times New Roman" w:eastAsia="Times New Roman" w:hAnsi="Times New Roman"/>
               </w:rPr>
-              <w:t xml:space="preserve">{{simulation_question_2}}</w:t>
+              <w:t>{{simulation_question_2}}</w:t>
             </w:r>
           </w:p>
         </w:tc>
         <w:tc>
           <w:tcPr>
             <w:tcW w:w="895" w:type="dxa"/>
-            <w:tcBorders>
-              <w:top w:val="single" w:sz="6" w:space="0" w:color="auto"/>
-              <w:left w:val="single" w:sz="6" w:space="0" w:color="auto"/>
-              <w:bottom w:val="single" w:sz="6" w:space="0" w:color="auto"/>
-              <w:right w:val="single" w:sz="6" w:space="0" w:color="auto"/>
-            </w:tcBorders>
             <w:tcMar>
               <w:top w:w="30" w:type="dxa"/>
               <w:left w:w="30" w:type="dxa"/>
@@ -1426,19 +1496,13 @@
               <w:rPr>
                 <w:rFonts w:ascii="Times New Roman" w:eastAsia="Times New Roman" w:hAnsi="Times New Roman"/>
               </w:rPr>
-              <w:t xml:space="preserve">{{simulation_question_3}}</w:t>
+              <w:t>{{simulation_question_3}}</w:t>
             </w:r>
           </w:p>
         </w:tc>
         <w:tc>
           <w:tcPr>
             <w:tcW w:w="895" w:type="dxa"/>
-            <w:tcBorders>
-              <w:top w:val="single" w:sz="6" w:space="0" w:color="auto"/>
-              <w:left w:val="single" w:sz="6" w:space="0" w:color="auto"/>
-              <w:bottom w:val="single" w:sz="6" w:space="0" w:color="auto"/>
-              <w:right w:val="single" w:sz="6" w:space="0" w:color="auto"/>
-            </w:tcBorders>
             <w:tcMar>
               <w:top w:w="30" w:type="dxa"/>
               <w:left w:w="30" w:type="dxa"/>
@@ -1456,19 +1520,13 @@
               <w:rPr>
                 <w:rFonts w:ascii="Times New Roman" w:eastAsia="Times New Roman" w:hAnsi="Times New Roman"/>
               </w:rPr>
-              <w:t xml:space="preserve">{{simulation_question_4}}</w:t>
+              <w:t>{{simulation_question_4}}</w:t>
             </w:r>
           </w:p>
         </w:tc>
         <w:tc>
           <w:tcPr>
             <w:tcW w:w="895" w:type="dxa"/>
-            <w:tcBorders>
-              <w:top w:val="single" w:sz="6" w:space="0" w:color="auto"/>
-              <w:left w:val="single" w:sz="6" w:space="0" w:color="auto"/>
-              <w:bottom w:val="single" w:sz="6" w:space="0" w:color="auto"/>
-              <w:right w:val="single" w:sz="6" w:space="0" w:color="auto"/>
-            </w:tcBorders>
             <w:tcMar>
               <w:top w:w="30" w:type="dxa"/>
               <w:left w:w="30" w:type="dxa"/>
@@ -1486,19 +1544,13 @@
               <w:rPr>
                 <w:rFonts w:ascii="Times New Roman" w:eastAsia="Times New Roman" w:hAnsi="Times New Roman"/>
               </w:rPr>
-              <w:t xml:space="preserve">{{simulation_question_5}}</w:t>
+              <w:t>{{simulation_question_5}}</w:t>
             </w:r>
           </w:p>
         </w:tc>
         <w:tc>
           <w:tcPr>
             <w:tcW w:w="895" w:type="dxa"/>
-            <w:tcBorders>
-              <w:top w:val="single" w:sz="6" w:space="0" w:color="auto"/>
-              <w:left w:val="single" w:sz="6" w:space="0" w:color="auto"/>
-              <w:bottom w:val="single" w:sz="6" w:space="0" w:color="auto"/>
-              <w:right w:val="single" w:sz="6" w:space="0" w:color="auto"/>
-            </w:tcBorders>
             <w:tcMar>
               <w:top w:w="30" w:type="dxa"/>
               <w:left w:w="30" w:type="dxa"/>
@@ -1516,7 +1568,7 @@
               <w:rPr>
                 <w:rFonts w:ascii="Times New Roman" w:eastAsia="Times New Roman" w:hAnsi="Times New Roman"/>
               </w:rPr>
-              <w:t xml:space="preserve">{{simulation_question_6}}</w:t>
+              <w:t>{{simulation_question_6}}</w:t>
             </w:r>
           </w:p>
         </w:tc>
@@ -1524,12 +1576,6 @@
           <w:tcPr>
             <w:tcW w:w="895" w:type="dxa"/>
             <w:gridSpan w:val="2"/>
-            <w:tcBorders>
-              <w:top w:val="single" w:sz="6" w:space="0" w:color="auto"/>
-              <w:left w:val="single" w:sz="6" w:space="0" w:color="auto"/>
-              <w:bottom w:val="single" w:sz="6" w:space="0" w:color="auto"/>
-              <w:right w:val="single" w:sz="6" w:space="0" w:color="auto"/>
-            </w:tcBorders>
             <w:tcMar>
               <w:top w:w="30" w:type="dxa"/>
               <w:left w:w="30" w:type="dxa"/>
@@ -1547,19 +1593,13 @@
               <w:rPr>
                 <w:rFonts w:ascii="Times New Roman" w:eastAsia="Times New Roman" w:hAnsi="Times New Roman"/>
               </w:rPr>
-              <w:t xml:space="preserve">{{simulation_question_7}}</w:t>
+              <w:t>{{simulation_question_7}}</w:t>
             </w:r>
           </w:p>
         </w:tc>
         <w:tc>
           <w:tcPr>
             <w:tcW w:w="895" w:type="dxa"/>
-            <w:tcBorders>
-              <w:top w:val="single" w:sz="6" w:space="0" w:color="auto"/>
-              <w:left w:val="single" w:sz="6" w:space="0" w:color="auto"/>
-              <w:bottom w:val="single" w:sz="6" w:space="0" w:color="auto"/>
-              <w:right w:val="single" w:sz="6" w:space="0" w:color="auto"/>
-            </w:tcBorders>
             <w:tcMar>
               <w:top w:w="30" w:type="dxa"/>
               <w:left w:w="30" w:type="dxa"/>
@@ -1577,19 +1617,13 @@
               <w:rPr>
                 <w:rFonts w:ascii="Times New Roman" w:eastAsia="Times New Roman" w:hAnsi="Times New Roman"/>
               </w:rPr>
-              <w:t xml:space="preserve">{{simulation_question_8}}</w:t>
+              <w:t>{{simulation_question_8}}</w:t>
             </w:r>
           </w:p>
         </w:tc>
         <w:tc>
           <w:tcPr>
             <w:tcW w:w="895" w:type="dxa"/>
-            <w:tcBorders>
-              <w:top w:val="single" w:sz="6" w:space="0" w:color="auto"/>
-              <w:left w:val="single" w:sz="6" w:space="0" w:color="auto"/>
-              <w:bottom w:val="single" w:sz="6" w:space="0" w:color="auto"/>
-              <w:right w:val="single" w:sz="6" w:space="0" w:color="auto"/>
-            </w:tcBorders>
             <w:tcMar>
               <w:top w:w="30" w:type="dxa"/>
               <w:left w:w="30" w:type="dxa"/>
@@ -1607,7 +1641,7 @@
               <w:rPr>
                 <w:rFonts w:ascii="Times New Roman" w:eastAsia="Times New Roman" w:hAnsi="Times New Roman"/>
               </w:rPr>
-              <w:t xml:space="preserve">{{simulation_question_9}}</w:t>
+              <w:t>{{simulation_question_9}}</w:t>
             </w:r>
           </w:p>
         </w:tc>
@@ -1615,12 +1649,6 @@
           <w:tcPr>
             <w:tcW w:w="895" w:type="dxa"/>
             <w:gridSpan w:val="2"/>
-            <w:tcBorders>
-              <w:top w:val="single" w:sz="6" w:space="0" w:color="auto"/>
-              <w:left w:val="single" w:sz="6" w:space="0" w:color="auto"/>
-              <w:bottom w:val="single" w:sz="6" w:space="0" w:color="auto"/>
-              <w:right w:val="single" w:sz="6" w:space="0" w:color="auto"/>
-            </w:tcBorders>
             <w:tcMar>
               <w:top w:w="30" w:type="dxa"/>
               <w:left w:w="30" w:type="dxa"/>
@@ -1638,7 +1666,7 @@
               <w:rPr>
                 <w:rFonts w:ascii="Times New Roman" w:eastAsia="Times New Roman" w:hAnsi="Times New Roman"/>
               </w:rPr>
-              <w:t xml:space="preserve">{{simulation_question_10}}</w:t>
+              <w:t>{{simulation_question_10}}</w:t>
             </w:r>
           </w:p>
         </w:tc>
@@ -1653,7 +1681,7 @@
           <w:rFonts w:ascii="Times New Roman" w:eastAsia="Times New Roman" w:hAnsi="Times New Roman"/>
           <w:b/>
         </w:rPr>
-        <w:t xml:space="preserve">Kết luận:</w:t>
+        <w:t>Kết luận:</w:t>
       </w:r>
     </w:p>
     <w:p>
@@ -1664,21 +1692,7 @@
         <w:rPr>
           <w:rFonts w:ascii="Times New Roman" w:eastAsia="Times New Roman" w:hAnsi="Times New Roman"/>
         </w:rPr>
-        <w:t xml:space="preserve">Số điểm đạt được</w:t>
-      </w:r>
-      <w:proofErr w:type="gramStart"/>
-      <w:r>
-        <w:rPr>
-          <w:rFonts w:ascii="Times New Roman" w:eastAsia="Times New Roman" w:hAnsi="Times New Roman"/>
-        </w:rPr>
-        <w:t xml:space="preserve">: {{simulation_gained_score}}</w:t>
-      </w:r>
-      <w:proofErr w:type="gramEnd"/>
-      <w:r>
-        <w:rPr>
-          <w:rFonts w:ascii="Times New Roman" w:eastAsia="Times New Roman" w:hAnsi="Times New Roman"/>
-        </w:rPr>
-        <w:t/>
+        <w:t>Số điểm đạt được: {{simulation_gained_score}}</w:t>
       </w:r>
     </w:p>
     <w:tbl>
@@ -1733,7 +1747,7 @@
                 <w:rFonts w:ascii="Times New Roman" w:eastAsia="Times New Roman" w:hAnsi="Times New Roman"/>
                 <w:b/>
               </w:rPr>
-              <w:t xml:space="preserve">Đạt:</w:t>
+              <w:t>Đạt:</w:t>
             </w:r>
           </w:p>
         </w:tc>
@@ -1763,7 +1777,7 @@
               <w:rPr>
                 <w:rFonts w:ascii="Times New Roman" w:eastAsia="Times New Roman" w:hAnsi="Times New Roman"/>
               </w:rPr>
-              <w:t xml:space="preserve">{{simulation_passed_check}}</w:t>
+              <w:t>{{simulation_passed_check}}</w:t>
             </w:r>
           </w:p>
         </w:tc>
@@ -1787,7 +1801,7 @@
                 <w:rFonts w:ascii="Times New Roman" w:eastAsia="Times New Roman" w:hAnsi="Times New Roman"/>
                 <w:b/>
               </w:rPr>
-              <w:t xml:space="preserve">Không đạt:</w:t>
+              <w:t>Không đạt:</w:t>
             </w:r>
           </w:p>
         </w:tc>
@@ -1847,6 +1861,7 @@
               <w:rPr>
                 <w:rFonts w:ascii="Times New Roman" w:eastAsia="Times New Roman" w:hAnsi="Times New Roman"/>
               </w:rPr>
+              <w:lastRenderedPageBreak/>
               <w:t xml:space="preserve"> </w:t>
             </w:r>
             <w:r>
@@ -1855,7 +1870,7 @@
                 <w:b/>
                 <w:i/>
               </w:rPr>
-              <w:t xml:space="preserve">Sát hạch viên ký xác nhận</w:t>
+              <w:t>Sát hạch viên ký xác nhận</w:t>
             </w:r>
           </w:p>
         </w:tc>
@@ -1881,7 +1896,7 @@
                 <w:b/>
                 <w:i/>
               </w:rPr>
-              <w:t xml:space="preserve">Học viên ký xác nhận kết quả</w:t>
+              <w:t>Học viên ký xác nhận kết quả</w:t>
             </w:r>
           </w:p>
         </w:tc>
@@ -1928,9 +1943,11 @@
         </w:tc>
       </w:tr>
     </w:tbl>
+    <w:p/>
     <w:sectPr>
       <w:pgSz w:w="11906" w:h="16838"/>
       <w:pgMar w:top="790" w:right="691" w:bottom="720" w:left="691" w:header="360" w:footer="360" w:gutter="0"/>
+      <w:paperSrc w:first="1" w:other="1"/>
       <w:cols w:space="720"/>
     </w:sectPr>
   </w:body>

</xml_diff>